<commit_message>
Bug-fix batch: mail list suppression paging, owner-check/teardown fixes, deal stage sync, follow-up stop rules, attorney letter greeting
Co-Authored-By: Claude Opus 5.5 <noreply@anthropic.com>
Claude-Session: https://claude.ai/code/session_01BamT8tWdcZjqPnQGE7uRYt
</commit_message>
<xml_diff>
--- a/mail-templates/Estate Attorney Letter (Blessings).docx
+++ b/mail-templates/Estate Attorney Letter (Blessings).docx
@@ -89,7 +89,7 @@
           <w:rFonts w:ascii="Patrick Hand" w:hAnsi="Patrick Hand" w:cs="Patrick Hand" w:eastAsia="Patrick Hand"/>
           <w:sz w:val="31"/>
         </w:rPr>
-        <w:t xml:space="preserve">Peace and blessings, </w:t>
+        <w:t xml:space="preserve">Dear </w:t>
       </w:r>
       <w:r>
         <w:rPr>
@@ -197,7 +197,7 @@
           <w:rFonts w:ascii="Patrick Hand" w:hAnsi="Patrick Hand" w:cs="Patrick Hand" w:eastAsia="Patrick Hand"/>
           <w:sz w:val="31"/>
         </w:rPr>
-        <w:t xml:space="preserve">More grace,</w:t>
+        <w:t xml:space="preserve">Sincerely,</w:t>
       </w:r>
     </w:p>
     <w:p>

</xml_diff>

<commit_message>
Bug-fix batch: mail list suppression paging, owner-check/teardown fixes, deal stage sync, follow-up stop rules, attorney letter greeting (#63)
Claude-Session: https://claude.ai/code/session_01BamT8tWdcZjqPnQGE7uRYt

Co-authored-by: Claude <noreply@anthropic.com>
</commit_message>
<xml_diff>
--- a/mail-templates/Estate Attorney Letter (Blessings).docx
+++ b/mail-templates/Estate Attorney Letter (Blessings).docx
@@ -89,7 +89,7 @@
           <w:rFonts w:ascii="Patrick Hand" w:hAnsi="Patrick Hand" w:cs="Patrick Hand" w:eastAsia="Patrick Hand"/>
           <w:sz w:val="31"/>
         </w:rPr>
-        <w:t xml:space="preserve">Peace and blessings, </w:t>
+        <w:t xml:space="preserve">Dear </w:t>
       </w:r>
       <w:r>
         <w:rPr>
@@ -197,7 +197,7 @@
           <w:rFonts w:ascii="Patrick Hand" w:hAnsi="Patrick Hand" w:cs="Patrick Hand" w:eastAsia="Patrick Hand"/>
           <w:sz w:val="31"/>
         </w:rPr>
-        <w:t xml:space="preserve">More grace,</w:t>
+        <w:t xml:space="preserve">Sincerely,</w:t>
       </w:r>
     </w:p>
     <w:p>

</xml_diff>